<commit_message>
Add Mentor Assigned Date field to Engagement entity (v0.4)
</commit_message>
<xml_diff>
--- a/PRDs/CBM-PRD-CRM-Implementation.docx
+++ b/PRDs/CBM-PRD-CRM-Implementation.docx
@@ -19468,6 +19468,163 @@
               <w:right w:val="single" w:color="CCCCCC" w:sz="1"/>
             </w:tcBorders>
             <w:shd w:fill="F2F2F2" w:val="clear"/>
+            <w:tcMar>
+              <w:top w:type="dxa" w:w="80"/>
+              <w:left w:type="dxa" w:w="120"/>
+              <w:bottom w:type="dxa" w:w="80"/>
+              <w:right w:type="dxa" w:w="120"/>
+            </w:tcMar>
+            <w:vAlign w:val="top"/>
+          </w:tcPr>
+          <w:p>
+            <w:r>
+              <w:rPr>
+                <w:rFonts w:ascii="Arial" w:cs="Arial" w:eastAsia="Arial" w:hAnsi="Arial"/>
+                <w:b w:val="false"/>
+                <w:bCs w:val="false"/>
+                <w:sz w:val="18"/>
+                <w:szCs w:val="18"/>
+              </w:rPr>
+              <w:t xml:space="preserve">Mentor Assigned Date</w:t>
+            </w:r>
+          </w:p>
+        </w:tc>
+        <w:tc>
+          <w:tcPr>
+            <w:tcW w:type="dxa" w:w="1200"/>
+            <w:tcBorders>
+              <w:top w:val="single" w:color="CCCCCC" w:sz="1"/>
+              <w:left w:val="single" w:color="CCCCCC" w:sz="1"/>
+              <w:bottom w:val="single" w:color="CCCCCC" w:sz="1"/>
+              <w:right w:val="single" w:color="CCCCCC" w:sz="1"/>
+            </w:tcBorders>
+            <w:shd w:fill="F2F2F2" w:val="clear"/>
+            <w:tcMar>
+              <w:top w:type="dxa" w:w="80"/>
+              <w:left w:type="dxa" w:w="120"/>
+              <w:bottom w:type="dxa" w:w="80"/>
+              <w:right w:type="dxa" w:w="120"/>
+            </w:tcMar>
+            <w:vAlign w:val="top"/>
+          </w:tcPr>
+          <w:p>
+            <w:r>
+              <w:rPr>
+                <w:rFonts w:ascii="Arial" w:cs="Arial" w:eastAsia="Arial" w:hAnsi="Arial"/>
+                <w:b w:val="false"/>
+                <w:bCs w:val="false"/>
+                <w:sz w:val="18"/>
+                <w:szCs w:val="18"/>
+              </w:rPr>
+              <w:t xml:space="preserve">Date</w:t>
+            </w:r>
+          </w:p>
+        </w:tc>
+        <w:tc>
+          <w:tcPr>
+            <w:tcW w:type="dxa" w:w="700"/>
+            <w:tcBorders>
+              <w:top w:val="single" w:color="CCCCCC" w:sz="1"/>
+              <w:left w:val="single" w:color="CCCCCC" w:sz="1"/>
+              <w:bottom w:val="single" w:color="CCCCCC" w:sz="1"/>
+              <w:right w:val="single" w:color="CCCCCC" w:sz="1"/>
+            </w:tcBorders>
+            <w:shd w:fill="F2F2F2" w:val="clear"/>
+            <w:tcMar>
+              <w:top w:type="dxa" w:w="80"/>
+              <w:left w:type="dxa" w:w="120"/>
+              <w:bottom w:type="dxa" w:w="80"/>
+              <w:right w:type="dxa" w:w="120"/>
+            </w:tcMar>
+            <w:vAlign w:val="top"/>
+          </w:tcPr>
+          <w:p>
+            <w:r>
+              <w:rPr>
+                <w:rFonts w:ascii="Arial" w:cs="Arial" w:eastAsia="Arial" w:hAnsi="Arial"/>
+                <w:b w:val="false"/>
+                <w:bCs w:val="false"/>
+                <w:sz w:val="18"/>
+                <w:szCs w:val="18"/>
+              </w:rPr>
+              <w:t xml:space="preserve">Auto</w:t>
+            </w:r>
+          </w:p>
+        </w:tc>
+        <w:tc>
+          <w:tcPr>
+            <w:tcW w:type="dxa" w:w="1560"/>
+            <w:tcBorders>
+              <w:top w:val="single" w:color="CCCCCC" w:sz="1"/>
+              <w:left w:val="single" w:color="CCCCCC" w:sz="1"/>
+              <w:bottom w:val="single" w:color="CCCCCC" w:sz="1"/>
+              <w:right w:val="single" w:color="CCCCCC" w:sz="1"/>
+            </w:tcBorders>
+            <w:shd w:fill="F2F2F2" w:val="clear"/>
+            <w:tcMar>
+              <w:top w:type="dxa" w:w="80"/>
+              <w:left w:type="dxa" w:w="120"/>
+              <w:bottom w:type="dxa" w:w="80"/>
+              <w:right w:type="dxa" w:w="120"/>
+            </w:tcMar>
+            <w:vAlign w:val="top"/>
+          </w:tcPr>
+          <w:p>
+            <w:r>
+              <w:rPr>
+                <w:rFonts w:ascii="Arial" w:cs="Arial" w:eastAsia="Arial" w:hAnsi="Arial"/>
+                <w:b w:val="false"/>
+                <w:bCs w:val="false"/>
+                <w:sz w:val="18"/>
+                <w:szCs w:val="18"/>
+              </w:rPr>
+              <w:t xml:space="preserve">All</w:t>
+            </w:r>
+          </w:p>
+        </w:tc>
+        <w:tc>
+          <w:tcPr>
+            <w:tcW w:type="dxa" w:w="4100"/>
+            <w:tcBorders>
+              <w:top w:val="single" w:color="CCCCCC" w:sz="1"/>
+              <w:left w:val="single" w:color="CCCCCC" w:sz="1"/>
+              <w:bottom w:val="single" w:color="CCCCCC" w:sz="1"/>
+              <w:right w:val="single" w:color="CCCCCC" w:sz="1"/>
+            </w:tcBorders>
+            <w:shd w:fill="F2F2F2" w:val="clear"/>
+            <w:tcMar>
+              <w:top w:type="dxa" w:w="80"/>
+              <w:left w:type="dxa" w:w="120"/>
+              <w:bottom w:type="dxa" w:w="80"/>
+              <w:right w:type="dxa" w:w="120"/>
+            </w:tcMar>
+            <w:vAlign w:val="top"/>
+          </w:tcPr>
+          <w:p>
+            <w:r>
+              <w:rPr>
+                <w:rFonts w:ascii="Arial" w:cs="Arial" w:eastAsia="Arial" w:hAnsi="Arial"/>
+                <w:b w:val="false"/>
+                <w:bCs w:val="false"/>
+                <w:sz w:val="18"/>
+                <w:szCs w:val="18"/>
+              </w:rPr>
+              <w:t xml:space="preserve">System-populated on status change to Assigned. Read-only. Used to measure elapsed time between mentor assignment and first session (Assigned → Active).</w:t>
+            </w:r>
+          </w:p>
+        </w:tc>
+      </w:tr>
+      <w:tr>
+        <w:tc>
+          <w:tcPr>
+            <w:tcW w:type="dxa" w:w="1800"/>
+            <w:tcBorders>
+              <w:top w:val="single" w:color="CCCCCC" w:sz="1"/>
+              <w:left w:val="single" w:color="CCCCCC" w:sz="1"/>
+              <w:bottom w:val="single" w:color="CCCCCC" w:sz="1"/>
+              <w:right w:val="single" w:color="CCCCCC" w:sz="1"/>
+            </w:tcBorders>
+            <w:shd w:fill="FFFFFF" w:val="clear"/>
             <w:tcMar>
               <w:top w:type="dxa" w:w="80"/>
               <w:left w:type="dxa" w:w="120"/>
@@ -47363,7 +47520,7 @@
                 <w:sz w:val="18"/>
                 <w:szCs w:val="18"/>
               </w:rPr>
-              <w:t>0.3</w:t>
+              <w:t>0.4</w:t>
             </w:r>
           </w:p>
         </w:tc>
@@ -47424,7 +47581,7 @@
                 <w:sz w:val="18"/>
                 <w:szCs w:val="18"/>
               </w:rPr>
-              <w:t>In Progress — Section 4 List Views &amp; Filters Added</w:t>
+              <w:t>In Progress — Mentor Assigned Date added to Engagement</w:t>
             </w:r>
           </w:p>
         </w:tc>

</xml_diff>

<commit_message>
Implementation Plan: Remove Phase 1/Phase 2 intake framing from Company entity sections; rename headings and checklist items to Business Identity/Classification/Detail
</commit_message>
<xml_diff>
--- a/PRDs/CBM-PRD-CRM-Implementation.docx
+++ b/PRDs/CBM-PRD-CRM-Implementation.docx
@@ -4583,7 +4583,7 @@
           <w:sz w:val="20"/>
           <w:szCs w:val="20"/>
         </w:rPr>
-        <w:t xml:space="preserve">The Company entity represents the business being mentored (EspoCRM native Account entity, relabeled). Fields are collected in two phases: Phase 1 on the public intake form; Phase 2 via a second form deployed at the mentor’s discretion. Both phases may be viewed and edited at any time by the assigned mentor or admin.</w:t>
+        <w:t xml:space="preserve">The Company entity represents the business being mentored (EspoCRM native Account entity, relabeled). All Company fields may be viewed and edited at any time by the assigned mentor or admin. The forms through which fields are initially collected are defined in CBM-PRD-CRM-Client.docx Section 4.1.</w:t>
       </w:r>
     </w:p>
     <w:p>
@@ -4598,7 +4598,7 @@
           <w:sz w:val="24"/>
           <w:szCs w:val="24"/>
         </w:rPr>
-        <w:t xml:space="preserve">2.4.1 Phase 1 — Intake Fields</w:t>
+        <w:t xml:space="preserve">2.4.1 Business Identity &amp; Classification Fields</w:t>
       </w:r>
     </w:p>
     <w:tbl>
@@ -6373,7 +6373,7 @@
           <w:sz w:val="24"/>
           <w:szCs w:val="24"/>
         </w:rPr>
-        <w:t xml:space="preserve">2.4.2 Phase 2 — Post-Assignment Fields</w:t>
+        <w:t xml:space="preserve">2.4.2 Business Detail Fields</w:t>
       </w:r>
     </w:p>
     <w:tbl>
@@ -29745,7 +29745,7 @@
                 <w:sz w:val="18"/>
                 <w:szCs w:val="18"/>
               </w:rPr>
-              <w:t>Company entity (Phase 2 client intake). Optional.</w:t>
+              <w:t>Company entity (Business Detail). Optional.</w:t>
             </w:r>
           </w:p>
         </w:tc>
@@ -29973,7 +29973,7 @@
                 <w:sz w:val="18"/>
                 <w:szCs w:val="18"/>
               </w:rPr>
-              <w:t>Company entity (Phase 2 client intake). Optional.</w:t>
+              <w:t>Company entity (Business Detail). Optional.</w:t>
             </w:r>
           </w:p>
         </w:tc>
@@ -30201,7 +30201,7 @@
                 <w:sz w:val="18"/>
                 <w:szCs w:val="18"/>
               </w:rPr>
-              <w:t>Company entity (Phase 2 client intake). Shown when Registered with State = Yes. Optional.</w:t>
+              <w:t>Company entity (Business Detail). Shown when Registered with State = Yes. Optional.</w:t>
             </w:r>
           </w:p>
         </w:tc>
@@ -30429,7 +30429,7 @@
                 <w:sz w:val="18"/>
                 <w:szCs w:val="18"/>
               </w:rPr>
-              <w:t>Company entity (Phase 2 client intake). Multi-select. Optional.</w:t>
+              <w:t>Company entity (Business Detail). Multi-select. Optional.</w:t>
             </w:r>
           </w:p>
         </w:tc>
@@ -43437,7 +43437,7 @@
           <w:sz w:val="18"/>
           <w:szCs w:val="18"/>
         </w:rPr>
-        <w:t>☐ Add Phase 1 fields: Organization Type, Company Role, Business Stage, NAICS Sector, NAICS Subsector, Mentoring Focus Areas (all dropdown/multi-select as configured above), Mentoring Needs Description (rich text, required).</w:t>
+        <w:t>☐ Add Business Classification fields: Organization Type, Company Role, Business Stage, NAICS Sector, NAICS Subsector, Mentoring Focus Areas (all dropdown/multi-select as configured above), Mentoring Needs Description (rich text, required).</w:t>
       </w:r>
     </w:p>
     <w:p>
@@ -43456,7 +43456,7 @@
           <w:sz w:val="18"/>
           <w:szCs w:val="18"/>
         </w:rPr>
-        <w:t>☐ Add Phase 2 fields: Business Description (rich text), Time in Operation (dropdown), Current Team Size (integer), Revenue Range (dropdown), Funding Situation (rich text), Current Challenges (rich text), Goals and Objectives (rich text), Desired Outcomes 6-12 Months (rich text), Previous Mentoring/Advisory Experience (rich text), Current Professional Advisors (multi-select), Registered with State (boolean), State of Registration (dropdown of US states), Legal Business Structure (dropdown), EIN on File (boolean), Date of Formation (date), Registered Agent (boolean), EIN Number (text, restricted).</w:t>
+        <w:t>☐ Add Business Detail fields: Business Description (rich text), Time in Operation (dropdown), Current Team Size (integer), Revenue Range (dropdown), Funding Situation (rich text), Current Challenges (rich text), Goals and Objectives (rich text), Desired Outcomes 6-12 Months (rich text), Previous Mentoring/Advisory Experience (rich text), Current Professional Advisors (multi-select), Registered with State (boolean), State of Registration (dropdown of US states), Legal Business Structure (dropdown), EIN on File (boolean), Date of Formation (date), Registered Agent (boolean), EIN Number (text, restricted).</w:t>
       </w:r>
     </w:p>
     <w:p>
@@ -43513,7 +43513,7 @@
           <w:sz w:val="18"/>
           <w:szCs w:val="18"/>
         </w:rPr>
-        <w:t>☐ Organize Company detail view into panels: Contact Information, Business Classification, Mentoring Context (Phase 1), Business Detail (Phase 2), Professional Advisors, Business Registration.</w:t>
+        <w:t>☐ Organize Company detail view into panels: Business Identity, Business Classification, Mentoring Context, Business Detail, Professional Advisors, Business Registration.</w:t>
       </w:r>
     </w:p>
     <w:p>
@@ -43532,7 +43532,7 @@
           <w:sz w:val="18"/>
           <w:szCs w:val="18"/>
         </w:rPr>
-        <w:t>☐ Configure Phase 2 panel as collapsible and labeled as post-assignment information.</w:t>
+        <w:t>☐ Configure Business Detail panel as a separate tab on the Company detail view, clearly labeled as post-assignment information.</w:t>
       </w:r>
     </w:p>
     <w:p>
@@ -47893,7 +47893,7 @@
           <w:sz w:val="18"/>
           <w:szCs w:val="18"/>
         </w:rPr>
-        <w:t>☐ Test Phase 2 client form delivery and verify response data populates correct Company fields.</w:t>
+        <w:t>☐ Test Business Detail form delivery and verify response data populates correct Company fields.</w:t>
       </w:r>
     </w:p>
     <w:p>

</xml_diff>

<commit_message>
Update Implementation PRD: replace old 5-role model with 13 personas across Phase 1, 2, 3, 5, 10, and 15
</commit_message>
<xml_diff>
--- a/PRDs/CBM-PRD-CRM-Implementation.docx
+++ b/PRDs/CBM-PRD-CRM-Implementation.docx
@@ -7545,7 +7545,7 @@
           <w:sz w:val="18"/>
           <w:szCs w:val="18"/>
         </w:rPr>
-        <w:t xml:space="preserve">☐ Configure Internal Only field-level access on Note and Document entities: when Internal Only = Yes, hide the record from all non-Admin roles.</w:t>
+        <w:t xml:space="preserve">☐ Configure Internal Only field-level access on Note and Document entities: when Internal Only = Yes, hide the record from all roles except System Administrator.</w:t>
       </w:r>
     </w:p>
     <w:p>
@@ -7871,7 +7871,7 @@
           <w:sz w:val="18"/>
           <w:szCs w:val="18"/>
         </w:rPr>
-        <w:t xml:space="preserve">☐ Configure field-level access: EIN Number visible to Admin and Primary Mentor roles only.</w:t>
+        <w:t xml:space="preserve">☐ Configure field-level access: EIN Number visible to System Administrator and Client Assignment Coordinator roles only.</w:t>
       </w:r>
     </w:p>
     <w:p>
@@ -8053,7 +8053,7 @@
           <w:sz w:val="18"/>
           <w:szCs w:val="18"/>
         </w:rPr>
-        <w:t xml:space="preserve">☐ Add CBM Gmail Address field (email, optional). Admin-populated. Read-only for Mentor role.</w:t>
+        <w:t xml:space="preserve">☐ Add CBM Gmail Address field (email, optional). Admin-populated. Read-only for Mentor role; full access for Mentor Administrator and System Administrator roles only.</w:t>
       </w:r>
     </w:p>
     <w:p>
@@ -8539,43 +8539,43 @@
           <w:sz w:val="18"/>
           <w:szCs w:val="18"/>
         </w:rPr>
-        <w:t xml:space="preserve">☐ Add Background Check Completed field (boolean, admin-only, hidden from Mentor). Mentor-specific.</w:t>
-      </w:r>
-    </w:p>
-    <w:p>
-      <w:pPr>
-        <w:pStyle w:val="ListParagraph"/>
-        <w:numPr>
-          <w:ilvl w:val="0"/>
-          <w:numId w:val="2"/>
-        </w:numPr>
-        <w:spacing w:after="60"/>
-      </w:pPr>
-      <w:r>
-        <w:rPr>
-          <w:rFonts w:ascii="Arial" w:cs="Arial" w:eastAsia="Arial" w:hAnsi="Arial"/>
-          <w:sz w:val="18"/>
-          <w:szCs w:val="18"/>
-        </w:rPr>
-        <w:t xml:space="preserve">☐ Add Background Check Date field (date, admin-only, hidden from Mentor). Mentor-specific.</w:t>
-      </w:r>
-    </w:p>
-    <w:p>
-      <w:pPr>
-        <w:pStyle w:val="ListParagraph"/>
-        <w:numPr>
-          <w:ilvl w:val="0"/>
-          <w:numId w:val="2"/>
-        </w:numPr>
-        <w:spacing w:after="60"/>
-      </w:pPr>
-      <w:r>
-        <w:rPr>
-          <w:rFonts w:ascii="Arial" w:cs="Arial" w:eastAsia="Arial" w:hAnsi="Arial"/>
-          <w:sz w:val="18"/>
-          <w:szCs w:val="18"/>
-        </w:rPr>
-        <w:t xml:space="preserve">☐ Add Felony Conviction field (boolean, admin-only, restricted, hidden from Mentor). Mentor-specific.</w:t>
+        <w:t xml:space="preserve">☐ Add Background Check Completed field (boolean, hidden from Mentor role; visible to Mentor Administrator and System Administrator only). Mentor-specific.</w:t>
+      </w:r>
+    </w:p>
+    <w:p>
+      <w:pPr>
+        <w:pStyle w:val="ListParagraph"/>
+        <w:numPr>
+          <w:ilvl w:val="0"/>
+          <w:numId w:val="2"/>
+        </w:numPr>
+        <w:spacing w:after="60"/>
+      </w:pPr>
+      <w:r>
+        <w:rPr>
+          <w:rFonts w:ascii="Arial" w:cs="Arial" w:eastAsia="Arial" w:hAnsi="Arial"/>
+          <w:sz w:val="18"/>
+          <w:szCs w:val="18"/>
+        </w:rPr>
+        <w:t xml:space="preserve">☐ Add Background Check Date field (date, hidden from Mentor role; visible to Mentor Administrator and System Administrator only). Mentor-specific.</w:t>
+      </w:r>
+    </w:p>
+    <w:p>
+      <w:pPr>
+        <w:pStyle w:val="ListParagraph"/>
+        <w:numPr>
+          <w:ilvl w:val="0"/>
+          <w:numId w:val="2"/>
+        </w:numPr>
+        <w:spacing w:after="60"/>
+      </w:pPr>
+      <w:r>
+        <w:rPr>
+          <w:rFonts w:ascii="Arial" w:cs="Arial" w:eastAsia="Arial" w:hAnsi="Arial"/>
+          <w:sz w:val="18"/>
+          <w:szCs w:val="18"/>
+        </w:rPr>
+        <w:t xml:space="preserve">☐ Add Felony Conviction field (boolean, restricted, hidden from Mentor role; visible to Mentor Administrator and System Administrator only). Mentor-specific.</w:t>
       </w:r>
     </w:p>
     <w:p>
@@ -8773,7 +8773,7 @@
           <w:sz w:val="18"/>
           <w:szCs w:val="18"/>
         </w:rPr>
-        <w:t xml:space="preserve">☐ Configure field-level access per CBM-PRD-CRM-Mentor.docx Section 5.2: Administrative fields read-only or hidden for Mentor role.</w:t>
+        <w:t xml:space="preserve">☐ Configure field-level access per CBM-PRD-CRM-Mentor.docx Section 5.2: Administrative fields read-only for Mentor role (CBM Gmail, Ethics Agreement, T&amp;C, Moodle, Dues Status, Dues Payment Date); hidden from Mentor role (Background Check, Felony Conviction, Departure fields). Full access for Mentor Administrator and System Administrator roles only.</w:t>
       </w:r>
     </w:p>
     <w:p>
@@ -9389,7 +9389,7 @@
           <w:sz w:val="18"/>
           <w:szCs w:val="18"/>
         </w:rPr>
-        <w:t xml:space="preserve">☐ Add Mentor Notes field (rich text, optional). Visible to assigned mentor and admin only.</w:t>
+        <w:t xml:space="preserve">☐ Add Mentor Notes field (rich text, optional). Visible to assigned Mentor, Mentor Administrator, Client Administrator, Client Assignment Coordinator, and System Administrator roles only.</w:t>
       </w:r>
     </w:p>
     <w:p>
@@ -10767,169 +10767,295 @@
           <w:sz w:val="18"/>
           <w:szCs w:val="18"/>
         </w:rPr>
-        <w:t xml:space="preserve">☐ Create or verify the Admin role with full Create/Read/Update/Delete access across all entities.</w:t>
-      </w:r>
-    </w:p>
-    <w:p>
-      <w:pPr>
-        <w:pStyle w:val="ListParagraph"/>
-        <w:numPr>
-          <w:ilvl w:val="0"/>
-          <w:numId w:val="2"/>
-        </w:numPr>
-        <w:spacing w:after="60"/>
-      </w:pPr>
-      <w:r>
-        <w:rPr>
-          <w:rFonts w:ascii="Arial" w:cs="Arial" w:eastAsia="Arial" w:hAnsi="Arial"/>
-          <w:sz w:val="18"/>
-          <w:szCs w:val="18"/>
-        </w:rPr>
-        <w:t xml:space="preserve">☐ Create the Primary Mentor role with Own Read/Update on Company, Contact (own record only), and Engagement; Own Create/Read/Update on Session, Notes, and Documents; Own Read on NPS Survey Responses, Workshops, and Dues.</w:t>
-      </w:r>
-    </w:p>
-    <w:p>
-      <w:pPr>
-        <w:pStyle w:val="ListParagraph"/>
-        <w:numPr>
-          <w:ilvl w:val="0"/>
-          <w:numId w:val="2"/>
-        </w:numPr>
-        <w:spacing w:after="60"/>
-      </w:pPr>
-      <w:r>
-        <w:rPr>
-          <w:rFonts w:ascii="Arial" w:cs="Arial" w:eastAsia="Arial" w:hAnsi="Arial"/>
-          <w:sz w:val="18"/>
-          <w:szCs w:val="18"/>
-        </w:rPr>
-        <w:t xml:space="preserve">☐ Create the Co-Mentor role with the same permissions as Primary Mentor, scoped to assigned Engagements.</w:t>
-      </w:r>
-    </w:p>
-    <w:p>
-      <w:pPr>
-        <w:pStyle w:val="ListParagraph"/>
-        <w:numPr>
-          <w:ilvl w:val="0"/>
-          <w:numId w:val="2"/>
-        </w:numPr>
-        <w:spacing w:after="60"/>
-      </w:pPr>
-      <w:r>
-        <w:rPr>
-          <w:rFonts w:ascii="Arial" w:cs="Arial" w:eastAsia="Arial" w:hAnsi="Arial"/>
-          <w:sz w:val="18"/>
-          <w:szCs w:val="18"/>
-        </w:rPr>
-        <w:t xml:space="preserve">☐ Create the SME role with Own Read on Company, Contact, and Engagement; Own Create/Read/Update on Session, Notes, and Documents; Own Read on NPS Survey Responses.</w:t>
-      </w:r>
-    </w:p>
-    <w:p>
-      <w:pPr>
-        <w:pStyle w:val="ListParagraph"/>
-        <w:numPr>
-          <w:ilvl w:val="0"/>
-          <w:numId w:val="2"/>
-        </w:numPr>
-        <w:spacing w:after="60"/>
-      </w:pPr>
-      <w:r>
-        <w:rPr>
-          <w:rFonts w:ascii="Arial" w:cs="Arial" w:eastAsia="Arial" w:hAnsi="Arial"/>
-          <w:sz w:val="18"/>
-          <w:szCs w:val="18"/>
-        </w:rPr>
-        <w:t xml:space="preserve">☐ Create the Board Member role with List-only Read on mentor Contact records. No access to individual Contact records, Engagement records, Session records, or Dues records.</w:t>
-      </w:r>
-    </w:p>
-    <w:p>
-      <w:pPr>
-        <w:pStyle w:val="ListParagraph"/>
-        <w:numPr>
-          <w:ilvl w:val="0"/>
-          <w:numId w:val="2"/>
-        </w:numPr>
-        <w:spacing w:after="60"/>
-      </w:pPr>
-      <w:r>
-        <w:rPr>
-          <w:rFonts w:ascii="Arial" w:cs="Arial" w:eastAsia="Arial" w:hAnsi="Arial"/>
-          <w:sz w:val="18"/>
-          <w:szCs w:val="18"/>
-        </w:rPr>
-        <w:t xml:space="preserve">☐ Configure field-level access on EIN Number: visible to Admin and Primary Mentor only.</w:t>
-      </w:r>
-    </w:p>
-    <w:p>
-      <w:pPr>
-        <w:pStyle w:val="ListParagraph"/>
-        <w:numPr>
-          <w:ilvl w:val="0"/>
-          <w:numId w:val="2"/>
-        </w:numPr>
-        <w:spacing w:after="60"/>
-      </w:pPr>
-      <w:r>
-        <w:rPr>
-          <w:rFonts w:ascii="Arial" w:cs="Arial" w:eastAsia="Arial" w:hAnsi="Arial"/>
-          <w:sz w:val="18"/>
-          <w:szCs w:val="18"/>
-        </w:rPr>
-        <w:t xml:space="preserve">☐ Configure field-level access on Internal Only Note and Document records: Admin only.</w:t>
-      </w:r>
-    </w:p>
-    <w:p>
-      <w:pPr>
-        <w:pStyle w:val="ListParagraph"/>
-        <w:numPr>
-          <w:ilvl w:val="0"/>
-          <w:numId w:val="2"/>
-        </w:numPr>
-        <w:spacing w:after="60"/>
-      </w:pPr>
-      <w:r>
-        <w:rPr>
-          <w:rFonts w:ascii="Arial" w:cs="Arial" w:eastAsia="Arial" w:hAnsi="Arial"/>
-          <w:sz w:val="18"/>
-          <w:szCs w:val="18"/>
-        </w:rPr>
-        <w:t xml:space="preserve">☐ Configure field-level access on Mentor Administrative fields per CBM-PRD-CRM-Mentor.docx Section 5.2: Ethics Agreement, T&amp;C, Moodle, Dues Status, Dues Payment Date, CBM Gmail Address = read-only for Mentor role. Background Check, Felony Conviction, Departure fields = hidden from Mentor role.</w:t>
-      </w:r>
-    </w:p>
-    <w:p>
-      <w:pPr>
-        <w:pStyle w:val="ListParagraph"/>
-        <w:numPr>
-          <w:ilvl w:val="0"/>
-          <w:numId w:val="2"/>
-        </w:numPr>
-        <w:spacing w:after="60"/>
-      </w:pPr>
-      <w:r>
-        <w:rPr>
-          <w:rFonts w:ascii="Arial" w:cs="Arial" w:eastAsia="Arial" w:hAnsi="Arial"/>
-          <w:sz w:val="18"/>
-          <w:szCs w:val="18"/>
-        </w:rPr>
-        <w:t xml:space="preserve">☐ Configure Teams to enforce record-level visibility scoping: mentors see only records linked to their assigned Engagements; clients have no CRM access.</w:t>
-      </w:r>
-    </w:p>
-    <w:p>
-      <w:pPr>
-        <w:pStyle w:val="ListParagraph"/>
-        <w:numPr>
-          <w:ilvl w:val="0"/>
-          <w:numId w:val="2"/>
-        </w:numPr>
-        <w:spacing w:after="60"/>
-      </w:pPr>
-      <w:r>
-        <w:rPr>
-          <w:rFonts w:ascii="Arial" w:cs="Arial" w:eastAsia="Arial" w:hAnsi="Arial"/>
-          <w:sz w:val="18"/>
-          <w:szCs w:val="18"/>
-        </w:rPr>
-        <w:t xml:space="preserve">☐ Test each role by logging in as a test user and verifying correct visibility, field-level access, and action permissions across all entity types.</w:t>
+        <w:t xml:space="preserve">☐ Create the System Administrator role with full Create/Read/Update/Delete access across all entities and full access to all system configuration, workflows, and user account management.</w:t>
+      </w:r>
+    </w:p>
+    <w:p>
+      <w:pPr>
+        <w:pStyle w:val="ListParagraph"/>
+        <w:numPr>
+          <w:ilvl w:val="0"/>
+          <w:numId w:val="2"/>
+        </w:numPr>
+        <w:spacing w:after="60"/>
+      </w:pPr>
+      <w:r>
+        <w:rPr>
+          <w:rFonts w:ascii="Arial" w:cs="Arial" w:eastAsia="Arial" w:hAnsi="Arial"/>
+          <w:sz w:val="18"/>
+          <w:szCs w:val="18"/>
+        </w:rPr>
+        <w:t xml:space="preserve">☐ Create the Executive Member role with Read-only access across all entities and all reports. No Create, Update, or Delete permissions on any entity. No access to system configuration.</w:t>
+      </w:r>
+    </w:p>
+    <w:p>
+      <w:pPr>
+        <w:pStyle w:val="ListParagraph"/>
+        <w:numPr>
+          <w:ilvl w:val="0"/>
+          <w:numId w:val="2"/>
+        </w:numPr>
+        <w:spacing w:after="60"/>
+      </w:pPr>
+      <w:r>
+        <w:rPr>
+          <w:rFonts w:ascii="Arial" w:cs="Arial" w:eastAsia="Arial" w:hAnsi="Arial"/>
+          <w:sz w:val="18"/>
+          <w:szCs w:val="18"/>
+        </w:rPr>
+        <w:t xml:space="preserve">☐ Create the Client Recruiter role with Read/Create/Update access on marketing Contact records and campaign-related data; Read access to event and workshop records and aggregate application trend reports. No access to individual client, engagement, or session records.</w:t>
+      </w:r>
+    </w:p>
+    <w:p>
+      <w:pPr>
+        <w:pStyle w:val="ListParagraph"/>
+        <w:numPr>
+          <w:ilvl w:val="0"/>
+          <w:numId w:val="2"/>
+        </w:numPr>
+        <w:spacing w:after="60"/>
+      </w:pPr>
+      <w:r>
+        <w:rPr>
+          <w:rFonts w:ascii="Arial" w:cs="Arial" w:eastAsia="Arial" w:hAnsi="Arial"/>
+          <w:sz w:val="18"/>
+          <w:szCs w:val="18"/>
+        </w:rPr>
+        <w:t xml:space="preserve">☐ Create the Mentor Recruiter role with Read/Create/Update access on mentor prospect Contact records; Read access to aggregate mentor application trend reports and current mentor roster capacity data. No access to individual engagement, session, or client records.</w:t>
+      </w:r>
+    </w:p>
+    <w:p>
+      <w:pPr>
+        <w:pStyle w:val="ListParagraph"/>
+        <w:numPr>
+          <w:ilvl w:val="0"/>
+          <w:numId w:val="2"/>
+        </w:numPr>
+        <w:spacing w:after="60"/>
+      </w:pPr>
+      <w:r>
+        <w:rPr>
+          <w:rFonts w:ascii="Arial" w:cs="Arial" w:eastAsia="Arial" w:hAnsi="Arial"/>
+          <w:sz w:val="18"/>
+          <w:szCs w:val="18"/>
+        </w:rPr>
+        <w:t xml:space="preserve">☐ Create the Client Administrator role with full Read/Create/Update access on Company, Contact (client type), and Engagement records; Read access to Session records, NPS Survey Responses, and partner referral data; Read access to communication history. No access to mentor administrative fields (background check, dues, felony conviction).</w:t>
+      </w:r>
+    </w:p>
+    <w:p>
+      <w:pPr>
+        <w:pStyle w:val="ListParagraph"/>
+        <w:numPr>
+          <w:ilvl w:val="0"/>
+          <w:numId w:val="2"/>
+        </w:numPr>
+        <w:spacing w:after="60"/>
+      </w:pPr>
+      <w:r>
+        <w:rPr>
+          <w:rFonts w:ascii="Arial" w:cs="Arial" w:eastAsia="Arial" w:hAnsi="Arial"/>
+          <w:sz w:val="18"/>
+          <w:szCs w:val="18"/>
+        </w:rPr>
+        <w:t xml:space="preserve">☐ Create the Mentor Administrator role with full Read/Create/Update access on Contact (mentor type) records including all administrative fields; Read access to Engagement and Session records linked to mentors; Read/Create/Update access on Dues records; Read access to Moodle training completion data. No access to individual client business data beyond what is needed to support mentor management.</w:t>
+      </w:r>
+    </w:p>
+    <w:p>
+      <w:pPr>
+        <w:pStyle w:val="ListParagraph"/>
+        <w:numPr>
+          <w:ilvl w:val="0"/>
+          <w:numId w:val="2"/>
+        </w:numPr>
+        <w:spacing w:after="60"/>
+      </w:pPr>
+      <w:r>
+        <w:rPr>
+          <w:rFonts w:ascii="Arial" w:cs="Arial" w:eastAsia="Arial" w:hAnsi="Arial"/>
+          <w:sz w:val="18"/>
+          <w:szCs w:val="18"/>
+        </w:rPr>
+        <w:t xml:space="preserve">☐ Create the Client Assignment Coordinator role with Read access on approved Company and Contact (client type) records; Read access to full mentor roster including availability and capacity fields; Read/Create/Update access on Engagement records; Read access to partner affiliation data. No access to mentor administrative fields (background check, dues, felony conviction).</w:t>
+      </w:r>
+    </w:p>
+    <w:p>
+      <w:pPr>
+        <w:pStyle w:val="ListParagraph"/>
+        <w:numPr>
+          <w:ilvl w:val="0"/>
+          <w:numId w:val="2"/>
+        </w:numPr>
+        <w:spacing w:after="60"/>
+      </w:pPr>
+      <w:r>
+        <w:rPr>
+          <w:rFonts w:ascii="Arial" w:cs="Arial" w:eastAsia="Arial" w:hAnsi="Arial"/>
+          <w:sz w:val="18"/>
+          <w:szCs w:val="18"/>
+        </w:rPr>
+        <w:t xml:space="preserve">☐ Create the Donor / Sponsor Coordinator role with full Read/Create/Update access on donor and sponsor Contact and Company records, donation and pledge records, grant records, and campaign data; Read access to related communication history. No access to client, engagement, session, or mentor records.</w:t>
+      </w:r>
+    </w:p>
+    <w:p>
+      <w:pPr>
+        <w:pStyle w:val="ListParagraph"/>
+        <w:numPr>
+          <w:ilvl w:val="0"/>
+          <w:numId w:val="2"/>
+        </w:numPr>
+        <w:spacing w:after="60"/>
+      </w:pPr>
+      <w:r>
+        <w:rPr>
+          <w:rFonts w:ascii="Arial" w:cs="Arial" w:eastAsia="Arial" w:hAnsi="Arial"/>
+          <w:sz w:val="18"/>
+          <w:szCs w:val="18"/>
+        </w:rPr>
+        <w:t xml:space="preserve">☐ Create the Partner Coordinator role with full Read/Create/Update access on partner organization Company and Contact records, partnership agreement data, and event co-sponsorship records; Read access to mentor records filtered by partner affiliation and client records filtered by partner referral source; Read/Create/Update access on communication history linked to partner records. No access to mentor administrative fields or unaffiliated client records.</w:t>
+      </w:r>
+    </w:p>
+    <w:p>
+      <w:pPr>
+        <w:pStyle w:val="ListParagraph"/>
+        <w:numPr>
+          <w:ilvl w:val="0"/>
+          <w:numId w:val="2"/>
+        </w:numPr>
+        <w:spacing w:after="60"/>
+      </w:pPr>
+      <w:r>
+        <w:rPr>
+          <w:rFonts w:ascii="Arial" w:cs="Arial" w:eastAsia="Arial" w:hAnsi="Arial"/>
+          <w:sz w:val="18"/>
+          <w:szCs w:val="18"/>
+        </w:rPr>
+        <w:t xml:space="preserve">☐ Create the Content and Event Administrator role with full Read/Create/Update access on Workshop and Workshop Attendance records; Read access to presenter Contact records, partner and sponsor records linked to events, and event analytics. No access to client, engagement, session, or mentor administrative records.</w:t>
+      </w:r>
+    </w:p>
+    <w:p>
+      <w:pPr>
+        <w:pStyle w:val="ListParagraph"/>
+        <w:numPr>
+          <w:ilvl w:val="0"/>
+          <w:numId w:val="2"/>
+        </w:numPr>
+        <w:spacing w:after="60"/>
+      </w:pPr>
+      <w:r>
+        <w:rPr>
+          <w:rFonts w:ascii="Arial" w:cs="Arial" w:eastAsia="Arial" w:hAnsi="Arial"/>
+          <w:sz w:val="18"/>
+          <w:szCs w:val="18"/>
+        </w:rPr>
+        <w:t xml:space="preserve">☐ Create the Mentor role with Own Read/Update on their own Contact record (excluding administrative fields); Own Read on assigned Company and Engagement records; Own Create/Read/Update on Session, Notes, and Documents linked to their assigned Engagements; Read on NPS Survey Responses linked to their Engagements; Read on Workshop records and mentor directory Contact records (name, expertise, contact info only). Cannot view other mentors’ client or engagement records.</w:t>
+      </w:r>
+    </w:p>
+    <w:p>
+      <w:pPr>
+        <w:pStyle w:val="ListParagraph"/>
+        <w:numPr>
+          <w:ilvl w:val="0"/>
+          <w:numId w:val="2"/>
+        </w:numPr>
+        <w:spacing w:after="60"/>
+      </w:pPr>
+      <w:r>
+        <w:rPr>
+          <w:rFonts w:ascii="Arial" w:cs="Arial" w:eastAsia="Arial" w:hAnsi="Arial"/>
+          <w:sz w:val="18"/>
+          <w:szCs w:val="18"/>
+        </w:rPr>
+        <w:t xml:space="preserve">☐ Create the Member role with Read access to own Contact record; Read access to Workshop and event schedule records; Read access to relevant organizational communications. No access to client, engagement, session, mentor administrative, donor, or partner records.</w:t>
+      </w:r>
+    </w:p>
+    <w:p>
+      <w:pPr>
+        <w:pStyle w:val="ListParagraph"/>
+        <w:numPr>
+          <w:ilvl w:val="0"/>
+          <w:numId w:val="2"/>
+        </w:numPr>
+        <w:spacing w:after="60"/>
+      </w:pPr>
+      <w:r>
+        <w:rPr>
+          <w:rFonts w:ascii="Arial" w:cs="Arial" w:eastAsia="Arial" w:hAnsi="Arial"/>
+          <w:sz w:val="18"/>
+          <w:szCs w:val="18"/>
+        </w:rPr>
+        <w:t xml:space="preserve">☐ Configure field-level access on EIN Number: visible to System Administrator and Client Assignment Coordinator roles only.</w:t>
+      </w:r>
+    </w:p>
+    <w:p>
+      <w:pPr>
+        <w:pStyle w:val="ListParagraph"/>
+        <w:numPr>
+          <w:ilvl w:val="0"/>
+          <w:numId w:val="2"/>
+        </w:numPr>
+        <w:spacing w:after="60"/>
+      </w:pPr>
+      <w:r>
+        <w:rPr>
+          <w:rFonts w:ascii="Arial" w:cs="Arial" w:eastAsia="Arial" w:hAnsi="Arial"/>
+          <w:sz w:val="18"/>
+          <w:szCs w:val="18"/>
+        </w:rPr>
+        <w:t xml:space="preserve">☐ Configure field-level access on Internal Only Note and Document records: System Administrator only.</w:t>
+      </w:r>
+    </w:p>
+    <w:p>
+      <w:pPr>
+        <w:pStyle w:val="ListParagraph"/>
+        <w:numPr>
+          <w:ilvl w:val="0"/>
+          <w:numId w:val="2"/>
+        </w:numPr>
+        <w:spacing w:after="60"/>
+      </w:pPr>
+      <w:r>
+        <w:rPr>
+          <w:rFonts w:ascii="Arial" w:cs="Arial" w:eastAsia="Arial" w:hAnsi="Arial"/>
+          <w:sz w:val="18"/>
+          <w:szCs w:val="18"/>
+        </w:rPr>
+        <w:t xml:space="preserve">☐ Configure field-level access on Mentor Administrative fields (Ethics Agreement, T&amp;C, Moodle, Dues Status, Dues Payment Date, CBM Gmail Address): read-only for Mentor role; full access for Mentor Administrator and System Administrator roles only. Background Check, Felony Conviction, and Departure fields: hidden from Mentor role; visible to Mentor Administrator and System Administrator only.</w:t>
+      </w:r>
+    </w:p>
+    <w:p>
+      <w:pPr>
+        <w:pStyle w:val="ListParagraph"/>
+        <w:numPr>
+          <w:ilvl w:val="0"/>
+          <w:numId w:val="2"/>
+        </w:numPr>
+        <w:spacing w:after="60"/>
+      </w:pPr>
+      <w:r>
+        <w:rPr>
+          <w:rFonts w:ascii="Arial" w:cs="Arial" w:eastAsia="Arial" w:hAnsi="Arial"/>
+          <w:sz w:val="18"/>
+          <w:szCs w:val="18"/>
+        </w:rPr>
+        <w:t xml:space="preserve">☐ Configure Teams to enforce record-level visibility scoping: Mentor role users see only records linked to their assigned Engagements. Client portal access is TBD — no client CRM roles to configure at this time.</w:t>
+      </w:r>
+    </w:p>
+    <w:p>
+      <w:pPr>
+        <w:pStyle w:val="ListParagraph"/>
+        <w:numPr>
+          <w:ilvl w:val="0"/>
+          <w:numId w:val="2"/>
+        </w:numPr>
+        <w:spacing w:after="60"/>
+      </w:pPr>
+      <w:r>
+        <w:rPr>
+          <w:rFonts w:ascii="Arial" w:cs="Arial" w:eastAsia="Arial" w:hAnsi="Arial"/>
+          <w:sz w:val="18"/>
+          <w:szCs w:val="18"/>
+        </w:rPr>
+        <w:t xml:space="preserve">☐ Test each role by logging in as a test user with that role assigned and verifying correct record visibility, field-level access, and action permissions across all entity types.</w:t>
       </w:r>
     </w:p>
     <w:p>
@@ -12091,61 +12217,61 @@
           <w:sz w:val="18"/>
           <w:szCs w:val="18"/>
         </w:rPr>
-        <w:t xml:space="preserve">☐ Test role-based access: log in as each role (Admin, Primary Mentor, Co-Mentor, SME, Board Member) and verify correct record visibility, field-level access, and action permissions.</w:t>
-      </w:r>
-    </w:p>
-    <w:p>
-      <w:pPr>
-        <w:pStyle w:val="ListParagraph"/>
-        <w:numPr>
-          <w:ilvl w:val="0"/>
-          <w:numId w:val="2"/>
-        </w:numPr>
-        <w:spacing w:after="60"/>
-      </w:pPr>
-      <w:r>
-        <w:rPr>
-          <w:rFonts w:ascii="Arial" w:cs="Arial" w:eastAsia="Arial" w:hAnsi="Arial"/>
-          <w:sz w:val="18"/>
-          <w:szCs w:val="18"/>
-        </w:rPr>
-        <w:t xml:space="preserve">☐ Test Board Member access: verify list-view only on mentor Contact records, no individual record access.</w:t>
-      </w:r>
-    </w:p>
-    <w:p>
-      <w:pPr>
-        <w:pStyle w:val="ListParagraph"/>
-        <w:numPr>
-          <w:ilvl w:val="0"/>
-          <w:numId w:val="2"/>
-        </w:numPr>
-        <w:spacing w:after="60"/>
-      </w:pPr>
-      <w:r>
-        <w:rPr>
-          <w:rFonts w:ascii="Arial" w:cs="Arial" w:eastAsia="Arial" w:hAnsi="Arial"/>
-          <w:sz w:val="18"/>
-          <w:szCs w:val="18"/>
-        </w:rPr>
-        <w:t xml:space="preserve">☐ Test Internal Only Note/Document: create Internal Only record as Admin, verify hidden from Mentor role.</w:t>
-      </w:r>
-    </w:p>
-    <w:p>
-      <w:pPr>
-        <w:pStyle w:val="ListParagraph"/>
-        <w:numPr>
-          <w:ilvl w:val="0"/>
-          <w:numId w:val="2"/>
-        </w:numPr>
-        <w:spacing w:after="60"/>
-      </w:pPr>
-      <w:r>
-        <w:rPr>
-          <w:rFonts w:ascii="Arial" w:cs="Arial" w:eastAsia="Arial" w:hAnsi="Arial"/>
-          <w:sz w:val="18"/>
-          <w:szCs w:val="18"/>
-        </w:rPr>
-        <w:t xml:space="preserve">☐ Test EIN Number field-level access: verify Co-Mentor and SME roles cannot see the field.</w:t>
+        <w:t xml:space="preserve">☐ Test role-based access: log in as a test user for each of the 13 personas (System Administrator, Executive Member, Client Recruiter, Mentor Recruiter, Client Administrator, Mentor Administrator, Client Assignment Coordinator, Donor / Sponsor Coordinator, Partner Coordinator, Content and Event Administrator, Mentor, Member) and verify correct record visibility, field-level access, and action permissions for each.</w:t>
+      </w:r>
+    </w:p>
+    <w:p>
+      <w:pPr>
+        <w:pStyle w:val="ListParagraph"/>
+        <w:numPr>
+          <w:ilvl w:val="0"/>
+          <w:numId w:val="2"/>
+        </w:numPr>
+        <w:spacing w:after="60"/>
+      </w:pPr>
+      <w:r>
+        <w:rPr>
+          <w:rFonts w:ascii="Arial" w:cs="Arial" w:eastAsia="Arial" w:hAnsi="Arial"/>
+          <w:sz w:val="18"/>
+          <w:szCs w:val="18"/>
+        </w:rPr>
+        <w:t xml:space="preserve">☐ Test Executive Member access: verify full read access across all records and reports; verify no Create, Update, or Delete actions are permitted on any entity.</w:t>
+      </w:r>
+    </w:p>
+    <w:p>
+      <w:pPr>
+        <w:pStyle w:val="ListParagraph"/>
+        <w:numPr>
+          <w:ilvl w:val="0"/>
+          <w:numId w:val="2"/>
+        </w:numPr>
+        <w:spacing w:after="60"/>
+      </w:pPr>
+      <w:r>
+        <w:rPr>
+          <w:rFonts w:ascii="Arial" w:cs="Arial" w:eastAsia="Arial" w:hAnsi="Arial"/>
+          <w:sz w:val="18"/>
+          <w:szCs w:val="18"/>
+        </w:rPr>
+        <w:t xml:space="preserve">☐ Test Internal Only Note/Document: create Internal Only record as System Administrator, verify hidden from all other roles including Mentor.</w:t>
+      </w:r>
+    </w:p>
+    <w:p>
+      <w:pPr>
+        <w:pStyle w:val="ListParagraph"/>
+        <w:numPr>
+          <w:ilvl w:val="0"/>
+          <w:numId w:val="2"/>
+        </w:numPr>
+        <w:spacing w:after="60"/>
+      </w:pPr>
+      <w:r>
+        <w:rPr>
+          <w:rFonts w:ascii="Arial" w:cs="Arial" w:eastAsia="Arial" w:hAnsi="Arial"/>
+          <w:sz w:val="18"/>
+          <w:szCs w:val="18"/>
+        </w:rPr>
+        <w:t xml:space="preserve">☐ Test EIN Number field-level access: verify only System Administrator and Client Assignment Coordinator roles can see the field; verify all other roles cannot.</w:t>
       </w:r>
     </w:p>
     <w:p>

</xml_diff>